<commit_message>
Tio Fixes My Stuff
</commit_message>
<xml_diff>
--- a/scripts/CASE_TEMPLATE.docx
+++ b/scripts/CASE_TEMPLATE.docx
@@ -204,6 +204,31 @@
           <w:p>
             <w:r>
               <w:t>Nama: Sari, Usia: 55, Pekerjaan: Ibu rumah tangga, Alamat: -</w:t>
+            </w:r>
+          </w:p>
+        </w:tc>
+      </w:tr>
+      <w:tr>
+        <w:tc>
+          <w:tcPr>
+            <w:tcW w:type="dxa" w:w="2200"/>
+          </w:tcPr>
+          <w:p>
+            <w:r>
+              <w:rPr>
+                <w:b/>
+              </w:rPr>
+              <w:t>Skenario Awal</w:t>
+            </w:r>
+          </w:p>
+        </w:tc>
+        <w:tc>
+          <w:tcPr>
+            <w:tcW w:type="dxa" w:w="4320"/>
+          </w:tcPr>
+          <w:p>
+            <w:r>
+              <w:t>Seorang wanita 55 tahun, datang ke poli dengan keluhan sering haus dan sering kencing.</w:t>
             </w:r>
           </w:p>
         </w:tc>
@@ -453,7 +478,7 @@
               <w:rPr>
                 <w:b/>
               </w:rPr>
-              <w:t>DD Pilihan</w:t>
+              <w:t>DD Diferensial Benar</w:t>
             </w:r>
           </w:p>
         </w:tc>
@@ -715,6 +740,29 @@
               <w:rPr>
                 <w:b/>
               </w:rPr>
+              <w:t>Skenario Awal</w:t>
+            </w:r>
+          </w:p>
+        </w:tc>
+        <w:tc>
+          <w:tcPr>
+            <w:tcW w:type="dxa" w:w="4320"/>
+          </w:tcPr>
+          <w:p>
+            <w:r/>
+          </w:p>
+        </w:tc>
+      </w:tr>
+      <w:tr>
+        <w:tc>
+          <w:tcPr>
+            <w:tcW w:type="dxa" w:w="2200"/>
+          </w:tcPr>
+          <w:p>
+            <w:r>
+              <w:rPr>
+                <w:b/>
+              </w:rPr>
               <w:t>Keluhan Utama</w:t>
             </w:r>
           </w:p>
@@ -899,7 +947,7 @@
               <w:rPr>
                 <w:b/>
               </w:rPr>
-              <w:t>DD Pilihan</w:t>
+              <w:t>DD Diferensial Benar</w:t>
             </w:r>
           </w:p>
         </w:tc>

</xml_diff>

<commit_message>
Added exam findings report feature
</commit_message>
<xml_diff>
--- a/scripts/CASE_TEMPLATE.docx
+++ b/scripts/CASE_TEMPLATE.docx
@@ -32,6 +32,8 @@
         <w:t xml:space="preserve">  Beri tanda * di depan baris kalau temuan itu signifikan, contoh: "*EKG: Elevasi ST V1-V4".</w:t>
         <w:br/>
         <w:t>• Gambar (EKG, rontgen, USG, dll): sisipkan gambar sebagai paragraf tersendiri TEPAT DI BAWAH baris temuan yang bersangkutan, masih di dalam sel yang sama. Konverter otomatis menempelkan gambar ke temuan di atasnya.</w:t>
+        <w:br/>
+        <w:t xml:space="preserve">• Wajib lapor gambar: beri tanda ! di depan baris temuan yang PAKAI GAMBAR untuk mewajibkan mahasiswa menuliskan laporan/interpretasi sendiri (esai bebas, tidak dinilai otomatis) sebelum melihat kunci jawaban — teks temuan aslinya baru ditampilkan saat kunci jawaban di akhir sesi, dibandingkan dengan jawaban mahasiswa. Boleh digabung dengan *, urutan bebas ("*!" atau "!*"). Tanpa tanda ini, gambar &amp; teks temuan tetap langsung ditampilkan seperti biasa. Contoh: "!Wajah Pasien: edema periorbital bilateral". Hanya berlaku kalau baris itu memang ada gambarnya — tidak wajib dipakai di semua temuan.</w:t>
         <w:br/>
         <w:t>• RPS &amp; Lifestyle: satu baris = satu poin.</w:t>
         <w:br/>
@@ -401,6 +403,16 @@
               <w:t>*Gula Darah Sewaktu: 320 mg/dL</w:t>
             </w:r>
           </w:p>
+          <w:p>
+            <w:r>
+              <w:t>!Wajah Pasien: edema periorbital bilateral, konjungtiva pucat</w:t>
+            </w:r>
+          </w:p>
+          <w:p>
+            <w:r>
+              <w:t>[SISIPKAN FOTO WAJAH PASIEN DI SINI — tanda ! = mahasiswa wajib lapor dulu sebelum lihat kunci jawaban]</w:t>
+            </w:r>
+          </w:p>
         </w:tc>
       </w:tr>
       <w:tr>
@@ -433,12 +445,12 @@
           </w:p>
           <w:p>
             <w:r>
-              <w:t>Foto Thorax: Dalam batas normal</w:t>
+              <w:t>!Foto Thorax: Dalam batas normal</w:t>
             </w:r>
           </w:p>
           <w:p>
             <w:r>
-              <w:t>[SISIPKAN GAMBAR RONTGEN DI SINI]</w:t>
+              <w:t>[SISIPKAN GAMBAR RONTGEN DI SINI — tanda ! = mahasiswa wajib lapor dulu sebelum lihat kunci jawaban]</w:t>
             </w:r>
           </w:p>
         </w:tc>

</xml_diff>